<commit_message>
Practical - 6 Completed
</commit_message>
<xml_diff>
--- a/Word_Doc/practical_5.docx
+++ b/Word_Doc/practical_5.docx
@@ -57,7 +57,7 @@
           <w:u w:val="single"/>
           <w:shd w:val="clear" w:color="auto" w:fill="FFFFFF"/>
         </w:rPr>
-        <w:t>4</w:t>
+        <w:t>5</w:t>
       </w:r>
     </w:p>
     <w:p>
@@ -105,113 +105,15 @@
           <w:szCs w:val="28"/>
           <w:shd w:val="clear" w:color="auto" w:fill="FFFFFF"/>
         </w:rPr>
-        <w:t xml:space="preserve">This practical demonstrates Java object modeling using classes, constructors, arrays, and the </w:t>
+        <w:t>This practical demonstrates abstraction, inheritance, constructors, arrays, and polymorphism in Java. Abstract classes and methods are used to define common behavior, while subclasses provide specific implementations for shape areas and employee salaries.</w:t>
       </w:r>
-      <w:proofErr w:type="gramStart"/>
-      <w:r>
+    </w:p>
+    <w:p>
+      <w:pPr>
+        <w:spacing w:after="0" w:line="240" w:lineRule="auto"/>
         <w:rPr>
           <w:rFonts w:ascii="Times New Roman" w:hAnsi="Times New Roman" w:cs="Times New Roman"/>
           <w:bCs/>
-          <w:color w:val="383D48"/>
-          <w:sz w:val="28"/>
-          <w:szCs w:val="28"/>
-          <w:shd w:val="clear" w:color="auto" w:fill="FFFFFF"/>
-        </w:rPr>
-        <w:t>equals(</w:t>
-      </w:r>
-      <w:proofErr w:type="gramEnd"/>
-      <w:r>
-        <w:rPr>
-          <w:rFonts w:ascii="Times New Roman" w:hAnsi="Times New Roman" w:cs="Times New Roman"/>
-          <w:bCs/>
-          <w:color w:val="383D48"/>
-          <w:sz w:val="28"/>
-          <w:szCs w:val="28"/>
-          <w:shd w:val="clear" w:color="auto" w:fill="FFFFFF"/>
-        </w:rPr>
-        <w:t xml:space="preserve">), </w:t>
-      </w:r>
-      <w:proofErr w:type="spellStart"/>
-      <w:proofErr w:type="gramStart"/>
-      <w:r>
-        <w:rPr>
-          <w:rFonts w:ascii="Times New Roman" w:hAnsi="Times New Roman" w:cs="Times New Roman"/>
-          <w:bCs/>
-          <w:color w:val="383D48"/>
-          <w:sz w:val="28"/>
-          <w:szCs w:val="28"/>
-          <w:shd w:val="clear" w:color="auto" w:fill="FFFFFF"/>
-        </w:rPr>
-        <w:t>hashCode</w:t>
-      </w:r>
-      <w:proofErr w:type="spellEnd"/>
-      <w:r>
-        <w:rPr>
-          <w:rFonts w:ascii="Times New Roman" w:hAnsi="Times New Roman" w:cs="Times New Roman"/>
-          <w:bCs/>
-          <w:color w:val="383D48"/>
-          <w:sz w:val="28"/>
-          <w:szCs w:val="28"/>
-          <w:shd w:val="clear" w:color="auto" w:fill="FFFFFF"/>
-        </w:rPr>
-        <w:t>(</w:t>
-      </w:r>
-      <w:proofErr w:type="gramEnd"/>
-      <w:r>
-        <w:rPr>
-          <w:rFonts w:ascii="Times New Roman" w:hAnsi="Times New Roman" w:cs="Times New Roman"/>
-          <w:bCs/>
-          <w:color w:val="383D48"/>
-          <w:sz w:val="28"/>
-          <w:szCs w:val="28"/>
-          <w:shd w:val="clear" w:color="auto" w:fill="FFFFFF"/>
-        </w:rPr>
-        <w:t xml:space="preserve">), and </w:t>
-      </w:r>
-      <w:proofErr w:type="spellStart"/>
-      <w:proofErr w:type="gramStart"/>
-      <w:r>
-        <w:rPr>
-          <w:rFonts w:ascii="Times New Roman" w:hAnsi="Times New Roman" w:cs="Times New Roman"/>
-          <w:bCs/>
-          <w:color w:val="383D48"/>
-          <w:sz w:val="28"/>
-          <w:szCs w:val="28"/>
-          <w:shd w:val="clear" w:color="auto" w:fill="FFFFFF"/>
-        </w:rPr>
-        <w:t>toString</w:t>
-      </w:r>
-      <w:proofErr w:type="spellEnd"/>
-      <w:r>
-        <w:rPr>
-          <w:rFonts w:ascii="Times New Roman" w:hAnsi="Times New Roman" w:cs="Times New Roman"/>
-          <w:bCs/>
-          <w:color w:val="383D48"/>
-          <w:sz w:val="28"/>
-          <w:szCs w:val="28"/>
-          <w:shd w:val="clear" w:color="auto" w:fill="FFFFFF"/>
-        </w:rPr>
-        <w:t>(</w:t>
-      </w:r>
-      <w:proofErr w:type="gramEnd"/>
-      <w:r>
-        <w:rPr>
-          <w:rFonts w:ascii="Times New Roman" w:hAnsi="Times New Roman" w:cs="Times New Roman"/>
-          <w:bCs/>
-          <w:color w:val="383D48"/>
-          <w:sz w:val="28"/>
-          <w:szCs w:val="28"/>
-          <w:shd w:val="clear" w:color="auto" w:fill="FFFFFF"/>
-        </w:rPr>
-        <w:t>) methods to compare, identify, and display objects based on their data.</w:t>
-      </w:r>
-    </w:p>
-    <w:p>
-      <w:pPr>
-        <w:spacing w:after="0" w:line="240" w:lineRule="auto"/>
-        <w:rPr>
-          <w:rFonts w:ascii="Times New Roman" w:hAnsi="Times New Roman" w:cs="Times New Roman"/>
-          <w:b/>
           <w:color w:val="383D48"/>
           <w:sz w:val="28"/>
           <w:szCs w:val="28"/>
@@ -255,17 +157,6 @@
           <w:shd w:val="clear" w:color="auto" w:fill="FFFFFF"/>
         </w:rPr>
       </w:pPr>
-      <w:r>
-        <w:rPr>
-          <w:rFonts w:ascii="Times New Roman" w:hAnsi="Times New Roman" w:cs="Times New Roman"/>
-          <w:b/>
-          <w:color w:val="383D48"/>
-          <w:sz w:val="28"/>
-          <w:szCs w:val="28"/>
-          <w:shd w:val="clear" w:color="auto" w:fill="FFFFFF"/>
-        </w:rPr>
-        <w:t xml:space="preserve"> </w:t>
-      </w:r>
     </w:p>
     <w:p>
       <w:pPr>
@@ -308,20 +199,6 @@
         </w:rPr>
         <w:t>:</w:t>
       </w:r>
-    </w:p>
-    <w:p>
-      <w:pPr>
-        <w:spacing w:after="0" w:line="240" w:lineRule="auto"/>
-        <w:ind w:left="720"/>
-        <w:rPr>
-          <w:rFonts w:ascii="Times New Roman" w:hAnsi="Times New Roman" w:cs="Times New Roman"/>
-          <w:b/>
-          <w:color w:val="383D48"/>
-          <w:sz w:val="28"/>
-          <w:szCs w:val="28"/>
-          <w:shd w:val="clear" w:color="auto" w:fill="FFFFFF"/>
-        </w:rPr>
-      </w:pPr>
     </w:p>
     <w:p>
       <w:pPr>
@@ -470,6 +347,7 @@
         <w:rPr>
           <w:rFonts w:ascii="Times New Roman" w:hAnsi="Times New Roman" w:cs="Times New Roman"/>
           <w:b/>
+          <w:noProof/>
           <w:color w:val="383D48"/>
           <w:sz w:val="28"/>
           <w:szCs w:val="28"/>
@@ -832,6 +710,7 @@
         <w:rPr>
           <w:rFonts w:ascii="Times New Roman" w:hAnsi="Times New Roman" w:cs="Times New Roman"/>
           <w:b/>
+          <w:noProof/>
           <w:color w:val="383D48"/>
           <w:sz w:val="28"/>
           <w:szCs w:val="28"/>
@@ -891,6 +770,7 @@
         <w:rPr>
           <w:rFonts w:ascii="Times New Roman" w:hAnsi="Times New Roman" w:cs="Times New Roman"/>
           <w:b/>
+          <w:noProof/>
           <w:color w:val="383D48"/>
           <w:sz w:val="28"/>
           <w:szCs w:val="28"/>
@@ -1594,10 +1474,8 @@
           <w:shd w:val="clear" w:color="auto" w:fill="FFFFFF"/>
           <w:lang w:val="en-IN"/>
         </w:rPr>
-        <w:t xml:space="preserve">The learning outcome of this practical is to understand and apply Java classes, constructors, arrays, </w:t>
+        <w:t>The learning outcome of this practical is to understand and apply abstract classes, abstract methods, inheritance, constructors, arrays, and polymorphism in Java. Students will learn to process different objects through a common parent reference, calculate shape areas and employee salaries, find totals and maximum values, and use instance</w:t>
       </w:r>
-      <w:proofErr w:type="spellStart"/>
-      <w:proofErr w:type="gramStart"/>
       <w:r>
         <w:rPr>
           <w:rFonts w:ascii="Times New Roman" w:hAnsi="Times New Roman" w:cs="Times New Roman"/>
@@ -1608,9 +1486,8 @@
           <w:shd w:val="clear" w:color="auto" w:fill="FFFFFF"/>
           <w:lang w:val="en-IN"/>
         </w:rPr>
-        <w:t>toString</w:t>
+        <w:t xml:space="preserve"> </w:t>
       </w:r>
-      <w:proofErr w:type="spellEnd"/>
       <w:r>
         <w:rPr>
           <w:rFonts w:ascii="Times New Roman" w:hAnsi="Times New Roman" w:cs="Times New Roman"/>
@@ -1621,10 +1498,12 @@
           <w:shd w:val="clear" w:color="auto" w:fill="FFFFFF"/>
           <w:lang w:val="en-IN"/>
         </w:rPr>
-        <w:t>(</w:t>
+        <w:t>of to identify specific object types.</w:t>
       </w:r>
-      <w:proofErr w:type="gramEnd"/>
-      <w:r>
+    </w:p>
+    <w:p>
+      <w:pPr>
+        <w:spacing w:after="0" w:line="240" w:lineRule="auto"/>
         <w:rPr>
           <w:rFonts w:ascii="Times New Roman" w:hAnsi="Times New Roman" w:cs="Times New Roman"/>
           <w:bCs/>
@@ -1634,74 +1513,7 @@
           <w:shd w:val="clear" w:color="auto" w:fill="FFFFFF"/>
           <w:lang w:val="en-IN"/>
         </w:rPr>
-        <w:t xml:space="preserve">), </w:t>
-      </w:r>
-      <w:proofErr w:type="gramStart"/>
-      <w:r>
-        <w:rPr>
-          <w:rFonts w:ascii="Times New Roman" w:hAnsi="Times New Roman" w:cs="Times New Roman"/>
-          <w:bCs/>
-          <w:color w:val="383D48"/>
-          <w:sz w:val="28"/>
-          <w:szCs w:val="28"/>
-          <w:shd w:val="clear" w:color="auto" w:fill="FFFFFF"/>
-          <w:lang w:val="en-IN"/>
-        </w:rPr>
-        <w:t>equals(</w:t>
-      </w:r>
-      <w:proofErr w:type="gramEnd"/>
-      <w:r>
-        <w:rPr>
-          <w:rFonts w:ascii="Times New Roman" w:hAnsi="Times New Roman" w:cs="Times New Roman"/>
-          <w:bCs/>
-          <w:color w:val="383D48"/>
-          <w:sz w:val="28"/>
-          <w:szCs w:val="28"/>
-          <w:shd w:val="clear" w:color="auto" w:fill="FFFFFF"/>
-          <w:lang w:val="en-IN"/>
-        </w:rPr>
-        <w:t xml:space="preserve">), and </w:t>
-      </w:r>
-      <w:proofErr w:type="spellStart"/>
-      <w:proofErr w:type="gramStart"/>
-      <w:r>
-        <w:rPr>
-          <w:rFonts w:ascii="Times New Roman" w:hAnsi="Times New Roman" w:cs="Times New Roman"/>
-          <w:bCs/>
-          <w:color w:val="383D48"/>
-          <w:sz w:val="28"/>
-          <w:szCs w:val="28"/>
-          <w:shd w:val="clear" w:color="auto" w:fill="FFFFFF"/>
-          <w:lang w:val="en-IN"/>
-        </w:rPr>
-        <w:t>hashCode</w:t>
-      </w:r>
-      <w:proofErr w:type="spellEnd"/>
-      <w:r>
-        <w:rPr>
-          <w:rFonts w:ascii="Times New Roman" w:hAnsi="Times New Roman" w:cs="Times New Roman"/>
-          <w:bCs/>
-          <w:color w:val="383D48"/>
-          <w:sz w:val="28"/>
-          <w:szCs w:val="28"/>
-          <w:shd w:val="clear" w:color="auto" w:fill="FFFFFF"/>
-          <w:lang w:val="en-IN"/>
-        </w:rPr>
-        <w:t>(</w:t>
-      </w:r>
-      <w:proofErr w:type="gramEnd"/>
-      <w:r>
-        <w:rPr>
-          <w:rFonts w:ascii="Times New Roman" w:hAnsi="Times New Roman" w:cs="Times New Roman"/>
-          <w:bCs/>
-          <w:color w:val="383D48"/>
-          <w:sz w:val="28"/>
-          <w:szCs w:val="28"/>
-          <w:shd w:val="clear" w:color="auto" w:fill="FFFFFF"/>
-          <w:lang w:val="en-IN"/>
-        </w:rPr>
-        <w:t>) methods. Students will learn to compare objects based on their data, identify duplicate objects, count distinct elements, and determine matching cards using object equality.</w:t>
-      </w:r>
+      </w:pPr>
     </w:p>
     <w:p>
       <w:pPr>

</xml_diff>